<commit_message>
feat(cv): sync docx and pdf with senior (03/2026-Present) and middle (12/2021-03/2026) milestones
</commit_message>
<xml_diff>
--- a/CV_Senior_QC_VietNguyen.docx
+++ b/CV_Senior_QC_VietNguyen.docx
@@ -460,7 +460,7 @@
           <w:sz w:val="21"/>
           <w:color w:val="2563EB"/>
         </w:rPr>
-        <w:t xml:space="preserve">Senior Software Quality Control (QC) Engineer  |  06/2022 – Present</w:t>
+        <w:t xml:space="preserve">Senior Software Quality Control (QC) Engineer  |  03/2026 – Present</w:t>
       </w:r>
     </w:p>
     <w:p>
@@ -588,6 +588,40 @@
       <w:r>
         <w:rPr>
           <w:b/>
+          <w:sz w:val="23"/>
+          <w:color w:val="0F172A"/>
+        </w:rPr>
+        <w:t xml:space="preserve">IT DRAGONS  </w:t>
+      </w:r>
+      <w:r>
+        <w:rPr>
+          <w:i/>
+          <w:sz w:val="20"/>
+          <w:color w:val="64748B"/>
+        </w:rPr>
+        <w:t xml:space="preserve">— Da Nang, Vietnam</w:t>
+      </w:r>
+    </w:p>
+    <w:p>
+      <w:pPr>
+        <w:spacing w:before="0" w:after="70"/>
+      </w:pPr>
+      <w:r>
+        <w:rPr>
+          <w:b/>
+          <w:sz w:val="21"/>
+          <w:color w:val="2563EB"/>
+        </w:rPr>
+        <w:t xml:space="preserve">Middle Software Quality Control (QC) Engineer  |  12/2021 – 03/2026</w:t>
+      </w:r>
+    </w:p>
+    <w:p>
+      <w:pPr>
+        <w:spacing w:before="90" w:after="20"/>
+      </w:pPr>
+      <w:r>
+        <w:rPr>
+          <w:b/>
           <w:sz w:val="21"/>
           <w:color w:val="0F172A"/>
         </w:rPr>
@@ -1008,7 +1042,7 @@
           <w:sz w:val="21"/>
           <w:color w:val="2563EB"/>
         </w:rPr>
-        <w:t xml:space="preserve">Junior / Fresher Software QC Engineer  |  04/2022 – 06/2022</w:t>
+        <w:t xml:space="preserve">Junior / Fresher Software QC Engineer  |  09/2021 – 12/2021</w:t>
       </w:r>
     </w:p>
     <w:p>

</xml_diff>